<commit_message>
Stop continuous-run progress from outliving its sender
A blank count puts QProgressBar into indeterminate mode; ending the run now converts it to a stable sent-count display so the UI matches the stopped controller.

Constraint: Qt 5.9 represents indeterminate progress with a zero maximum
Rejected: Emit a fake finite total from the controller | it would corrupt progress signal semantics
Confidence: high
Scope-risk: narrow
Reversibility: clean
Directive: Every path that ends a continuous run must leave the progress bar in a determinate state
Tested: Clean Qt 5.9.7 builds; 18/18 QtTest including continuousProgressStopsAnimating; 2000/2000 loopback; packaged smoke test; 32-page DOCX render and audits
Not-tested: Physical mouse-click capture with Packet Sender
</commit_message>
<xml_diff>
--- a/docs/CITEL-T-007_完整项目说明书_最终版.docx
+++ b/docs/CITEL-T-007_完整项目说明书_最终版.docx
@@ -1359,7 +1359,7 @@
           <w:rFonts w:ascii="Calibri" w:hAnsi="Calibri" w:eastAsia="Microsoft YaHei"/>
           <w:b w:val="0"/>
         </w:rPr>
-        <w:t>QtTest：17 passed，0 failed，0 skipped；</w:t>
+        <w:t>QtTest：18 passed，0 failed，0 skipped；</w:t>
       </w:r>
     </w:p>
     <w:p>
@@ -3591,7 +3591,7 @@
           <w:rFonts w:ascii="Consolas" w:hAnsi="Consolas" w:eastAsia="Microsoft YaHei"/>
           <w:sz w:val="17"/>
         </w:rPr>
-        <w:t>Totals: 17 passed, 0 failed, 0 skipped</w:t>
+        <w:t>Totals: 18 passed, 0 failed, 0 skipped</w:t>
         <w:br/>
       </w:r>
       <w:r>
@@ -12106,6 +12106,59 @@
                 <w:rFonts w:ascii="Consolas" w:hAnsi="Consolas" w:eastAsia="Microsoft YaHei"/>
                 <w:sz w:val="19"/>
               </w:rPr>
+              <w:t>continuousProgressStopsAnimating</w:t>
+            </w:r>
+          </w:p>
+        </w:tc>
+        <w:tc>
+          <w:tcPr>
+            <w:tcW w:type="dxa" w:w="4132"/>
+            <w:tcMar>
+              <w:top w:w="80" w:type="dxa"/>
+              <w:start w:w="120" w:type="dxa"/>
+              <w:bottom w:w="80" w:type="dxa"/>
+              <w:end w:w="120" w:type="dxa"/>
+            </w:tcMar>
+            <w:vAlign w:val="center"/>
+          </w:tcPr>
+          <w:p>
+            <w:pPr>
+              <w:spacing w:before="0" w:after="0" w:line="276" w:lineRule="auto"/>
+            </w:pPr>
+            <w:r>
+              <w:rPr>
+                <w:rFonts w:ascii="Calibri" w:hAnsi="Calibri" w:eastAsia="Microsoft YaHei"/>
+                <w:b w:val="0"/>
+              </w:rPr>
+              <w:t>持续发送停止后进度条退出滚动状态并显示实际发送数</w:t>
+            </w:r>
+          </w:p>
+        </w:tc>
+      </w:tr>
+      <w:tr>
+        <w:trPr>
+          <w:cantSplit/>
+        </w:trPr>
+        <w:tc>
+          <w:tcPr>
+            <w:tcW w:type="dxa" w:w="5228"/>
+            <w:tcMar>
+              <w:top w:w="80" w:type="dxa"/>
+              <w:start w:w="120" w:type="dxa"/>
+              <w:bottom w:w="80" w:type="dxa"/>
+              <w:end w:w="120" w:type="dxa"/>
+            </w:tcMar>
+            <w:vAlign w:val="center"/>
+          </w:tcPr>
+          <w:p>
+            <w:pPr>
+              <w:spacing w:before="0" w:after="0" w:line="276" w:lineRule="auto"/>
+            </w:pPr>
+            <w:r>
+              <w:rPr>
+                <w:rFonts w:ascii="Consolas" w:hAnsi="Consolas" w:eastAsia="Microsoft YaHei"/>
+                <w:sz w:val="19"/>
+              </w:rPr>
               <w:t>loopbackBenchmarkDeliversDatagrams</w:t>
             </w:r>
           </w:p>
@@ -12147,7 +12200,7 @@
           <w:rFonts w:ascii="Calibri" w:hAnsi="Calibri" w:eastAsia="Microsoft YaHei"/>
           <w:b w:val="0"/>
         </w:rPr>
-        <w:t>QtTest 还会统计初始化与清理阶段，因此当前最终总数显示为 17 passed。</w:t>
+        <w:t>QtTest 还会统计初始化与清理阶段，因此当前最终总数显示为 18 passed。</w:t>
       </w:r>
     </w:p>
     <w:p>
@@ -12193,7 +12246,7 @@
           <w:rFonts w:ascii="Calibri" w:hAnsi="Calibri" w:eastAsia="Microsoft YaHei"/>
           <w:b w:val="0"/>
         </w:rPr>
-        <w:t>17 passed，0 failed；</w:t>
+        <w:t>18 passed，0 failed；</w:t>
       </w:r>
     </w:p>
     <w:p>
@@ -12373,7 +12426,7 @@
           <w:rFonts w:ascii="Calibri" w:hAnsi="Calibri" w:eastAsia="Microsoft YaHei"/>
           <w:b w:val="0"/>
         </w:rPr>
-        <w:t>清空数量，持续发送数秒并停止，截图停止状态。</w:t>
+        <w:t>清空数量，持续发送数秒并停止，确认进度条停止滚动并显示实际发送数，截图停止状态。</w:t>
       </w:r>
     </w:p>
     <w:p>
@@ -15635,7 +15688,7 @@
           <w:rFonts w:ascii="Consolas" w:hAnsi="Consolas" w:eastAsia="Microsoft YaHei"/>
           <w:sz w:val="19"/>
         </w:rPr>
-        <w:t>17 passed, 0 failed</w:t>
+        <w:t>18 passed, 0 failed</w:t>
       </w:r>
       <w:r>
         <w:rPr>
@@ -16319,7 +16372,7 @@
           <w:rFonts w:ascii="Calibri" w:hAnsi="Calibri" w:eastAsia="Microsoft YaHei"/>
           <w:b w:val="0"/>
         </w:rPr>
-        <w:t>☐ 17 passed，0 failed；</w:t>
+        <w:t>☐ 18 passed，0 failed；</w:t>
       </w:r>
     </w:p>
     <w:p>

</xml_diff>